<commit_message>
Move employer signature line to after the closing "בברכה" in employment confirmation template
The signature line (and its § SMS-signing marker, see esign.py) sat
right after the "employed without a professional certificate" line,
above the closing. Moved it to sit right after "בברכה," so the letter
reads as a normal business closing with the employer's signature
space, then the company name/ID.

Co-Authored-By: Claude Sonnet 5 <noreply@anthropic.com>
Claude-Session: https://claude.ai/code/session_01914cfgYZHRbVfWX5kQ4szQ
</commit_message>
<xml_diff>
--- a/template_ishur_haaskaa.docx
+++ b/template_ishur_haaskaa.docx
@@ -219,6 +219,20 @@
     </w:p>
     <w:p>
       <w:pPr>
+        <w:rPr>
+          <w:rtl/>
+        </w:rPr>
+      </w:pPr>
+      <w:r>
+        <w:rPr>
+          <w:rFonts w:hint="cs"/>
+          <w:rtl/>
+        </w:rPr>
+        <w:t>בברכה,</w:t>
+      </w:r>
+    </w:p>
+    <w:p>
+      <w:pPr>
         <w:bidi/>
       </w:pPr>
       <w:r>
@@ -235,21 +249,6 @@
           <w:rtl/>
         </w:rPr>
         <w:t>§§§§§§</w:t>
-      </w:r>
-    </w:p>
-    <w:p/>
-    <w:p>
-      <w:pPr>
-        <w:rPr>
-          <w:rtl/>
-        </w:rPr>
-      </w:pPr>
-      <w:r>
-        <w:rPr>
-          <w:rFonts w:hint="cs"/>
-          <w:rtl/>
-        </w:rPr>
-        <w:t>בברכה,</w:t>
       </w:r>
     </w:p>
     <w:p>

</xml_diff>